<commit_message>
Update report/deck: temporal test + 3-method amount spread
</commit_message>
<xml_diff>
--- a/reports/LSOG_Mapping_Uncertainty_Report.docx
+++ b/reports/LSOG_Mapping_Uncertainty_Report.docx
@@ -2088,7 +2088,810 @@
         <w:pStyle w:val="Heading1"/>
       </w:pPr>
       <w:r>
-        <w:t xml:space="preserve">7.  Recommendations</w:t>
+        <w:t xml:space="preserve">7.  Is LSOG disappearing? An independent temporal test</w:t>
+      </w:r>
+    </w:p>
+    <w:p>
+      <w:pPr>
+        <w:spacing w:after="120"/>
+      </w:pPr>
+      <w:r>
+        <w:t xml:space="preserve">A central premise of the urgency narrative is that LSOG is rapidly disappearing (Hagan reports 1.37%/yr loss across the study area, 2.19%/yr on commercial timberland). We tested that with two independent measurements of the LSOG stock over the same unorganized townships: TreeMap imputation for 2016, 2020, and 2022, and the FIA design-based plot panels. </w:t>
+      </w:r>
+      <w:r>
+        <w:rPr>
+          <w:b/>
+          <w:bCs/>
+        </w:rPr>
+        <w:t xml:space="preserve">Both lines show LSOG stable to increasing, the opposite sign.</w:t>
+      </w:r>
+    </w:p>
+    <w:tbl>
+      <w:tblPr>
+        <w:tblW w:type="dxa" w:w="9360"/>
+        <w:tblBorders>
+          <w:top w:val="single" w:color="auto" w:sz="4"/>
+          <w:left w:val="single" w:color="auto" w:sz="4"/>
+          <w:bottom w:val="single" w:color="auto" w:sz="4"/>
+          <w:right w:val="single" w:color="auto" w:sz="4"/>
+          <w:insideH w:val="single" w:color="auto" w:sz="4"/>
+          <w:insideV w:val="single" w:color="auto" w:sz="4"/>
+        </w:tblBorders>
+      </w:tblPr>
+      <w:tblGrid>
+        <w:gridCol w:w="3360"/>
+        <w:gridCol w:w="1500"/>
+        <w:gridCol w:w="1500"/>
+        <w:gridCol w:w="1500"/>
+        <w:gridCol w:w="1500"/>
+      </w:tblGrid>
+      <w:tr>
+        <w:tc>
+          <w:tcPr>
+            <w:tcW w:type="dxa" w:w="3360"/>
+            <w:tcBorders>
+              <w:top w:val="single" w:color="CCCCCC" w:sz="1"/>
+              <w:left w:val="single" w:color="CCCCCC" w:sz="1"/>
+              <w:bottom w:val="single" w:color="CCCCCC" w:sz="1"/>
+              <w:right w:val="single" w:color="CCCCCC" w:sz="1"/>
+            </w:tcBorders>
+            <w:shd w:fill="1A3D28" w:val="clear"/>
+            <w:tcMar>
+              <w:top w:type="dxa" w:w="60"/>
+              <w:left w:type="dxa" w:w="110"/>
+              <w:bottom w:type="dxa" w:w="60"/>
+              <w:right w:type="dxa" w:w="110"/>
+            </w:tcMar>
+          </w:tcPr>
+          <w:p>
+            <w:pPr>
+              <w:jc w:val="left"/>
+            </w:pPr>
+            <w:r>
+              <w:rPr>
+                <w:b/>
+                <w:bCs/>
+                <w:color w:val="FFFFFF"/>
+                <w:sz w:val="19"/>
+                <w:szCs w:val="19"/>
+              </w:rPr>
+              <w:t xml:space="preserve">Line</w:t>
+            </w:r>
+          </w:p>
+        </w:tc>
+        <w:tc>
+          <w:tcPr>
+            <w:tcW w:type="dxa" w:w="1500"/>
+            <w:tcBorders>
+              <w:top w:val="single" w:color="CCCCCC" w:sz="1"/>
+              <w:left w:val="single" w:color="CCCCCC" w:sz="1"/>
+              <w:bottom w:val="single" w:color="CCCCCC" w:sz="1"/>
+              <w:right w:val="single" w:color="CCCCCC" w:sz="1"/>
+            </w:tcBorders>
+            <w:shd w:fill="1A3D28" w:val="clear"/>
+            <w:tcMar>
+              <w:top w:type="dxa" w:w="60"/>
+              <w:left w:type="dxa" w:w="110"/>
+              <w:bottom w:type="dxa" w:w="60"/>
+              <w:right w:type="dxa" w:w="110"/>
+            </w:tcMar>
+          </w:tcPr>
+          <w:p>
+            <w:pPr>
+              <w:jc w:val="right"/>
+            </w:pPr>
+            <w:r>
+              <w:rPr>
+                <w:b/>
+                <w:bCs/>
+                <w:color w:val="FFFFFF"/>
+                <w:sz w:val="19"/>
+                <w:szCs w:val="19"/>
+              </w:rPr>
+              <w:t xml:space="preserve">2016</w:t>
+            </w:r>
+          </w:p>
+        </w:tc>
+        <w:tc>
+          <w:tcPr>
+            <w:tcW w:type="dxa" w:w="1500"/>
+            <w:tcBorders>
+              <w:top w:val="single" w:color="CCCCCC" w:sz="1"/>
+              <w:left w:val="single" w:color="CCCCCC" w:sz="1"/>
+              <w:bottom w:val="single" w:color="CCCCCC" w:sz="1"/>
+              <w:right w:val="single" w:color="CCCCCC" w:sz="1"/>
+            </w:tcBorders>
+            <w:shd w:fill="1A3D28" w:val="clear"/>
+            <w:tcMar>
+              <w:top w:type="dxa" w:w="60"/>
+              <w:left w:type="dxa" w:w="110"/>
+              <w:bottom w:type="dxa" w:w="60"/>
+              <w:right w:type="dxa" w:w="110"/>
+            </w:tcMar>
+          </w:tcPr>
+          <w:p>
+            <w:pPr>
+              <w:jc w:val="right"/>
+            </w:pPr>
+            <w:r>
+              <w:rPr>
+                <w:b/>
+                <w:bCs/>
+                <w:color w:val="FFFFFF"/>
+                <w:sz w:val="19"/>
+                <w:szCs w:val="19"/>
+              </w:rPr>
+              <w:t xml:space="preserve">2020</w:t>
+            </w:r>
+          </w:p>
+        </w:tc>
+        <w:tc>
+          <w:tcPr>
+            <w:tcW w:type="dxa" w:w="1500"/>
+            <w:tcBorders>
+              <w:top w:val="single" w:color="CCCCCC" w:sz="1"/>
+              <w:left w:val="single" w:color="CCCCCC" w:sz="1"/>
+              <w:bottom w:val="single" w:color="CCCCCC" w:sz="1"/>
+              <w:right w:val="single" w:color="CCCCCC" w:sz="1"/>
+            </w:tcBorders>
+            <w:shd w:fill="1A3D28" w:val="clear"/>
+            <w:tcMar>
+              <w:top w:type="dxa" w:w="60"/>
+              <w:left w:type="dxa" w:w="110"/>
+              <w:bottom w:type="dxa" w:w="60"/>
+              <w:right w:type="dxa" w:w="110"/>
+            </w:tcMar>
+          </w:tcPr>
+          <w:p>
+            <w:pPr>
+              <w:jc w:val="right"/>
+            </w:pPr>
+            <w:r>
+              <w:rPr>
+                <w:b/>
+                <w:bCs/>
+                <w:color w:val="FFFFFF"/>
+                <w:sz w:val="19"/>
+                <w:szCs w:val="19"/>
+              </w:rPr>
+              <w:t xml:space="preserve">2022</w:t>
+            </w:r>
+          </w:p>
+        </w:tc>
+        <w:tc>
+          <w:tcPr>
+            <w:tcW w:type="dxa" w:w="1500"/>
+            <w:tcBorders>
+              <w:top w:val="single" w:color="CCCCCC" w:sz="1"/>
+              <w:left w:val="single" w:color="CCCCCC" w:sz="1"/>
+              <w:bottom w:val="single" w:color="CCCCCC" w:sz="1"/>
+              <w:right w:val="single" w:color="CCCCCC" w:sz="1"/>
+            </w:tcBorders>
+            <w:shd w:fill="1A3D28" w:val="clear"/>
+            <w:tcMar>
+              <w:top w:type="dxa" w:w="60"/>
+              <w:left w:type="dxa" w:w="110"/>
+              <w:bottom w:type="dxa" w:w="60"/>
+              <w:right w:type="dxa" w:w="110"/>
+            </w:tcMar>
+          </w:tcPr>
+          <w:p>
+            <w:pPr>
+              <w:jc w:val="right"/>
+            </w:pPr>
+            <w:r>
+              <w:rPr>
+                <w:b/>
+                <w:bCs/>
+                <w:color w:val="FFFFFF"/>
+                <w:sz w:val="19"/>
+                <w:szCs w:val="19"/>
+              </w:rPr>
+              <w:t xml:space="preserve">Annual change</w:t>
+            </w:r>
+          </w:p>
+        </w:tc>
+      </w:tr>
+      <w:tr>
+        <w:tc>
+          <w:tcPr>
+            <w:tcW w:type="dxa" w:w="3360"/>
+            <w:tcBorders>
+              <w:top w:val="single" w:color="CCCCCC" w:sz="1"/>
+              <w:left w:val="single" w:color="CCCCCC" w:sz="1"/>
+              <w:bottom w:val="single" w:color="CCCCCC" w:sz="1"/>
+              <w:right w:val="single" w:color="CCCCCC" w:sz="1"/>
+            </w:tcBorders>
+            <w:shd w:fill="FFFFFF" w:val="clear"/>
+            <w:tcMar>
+              <w:top w:type="dxa" w:w="60"/>
+              <w:left w:type="dxa" w:w="110"/>
+              <w:bottom w:type="dxa" w:w="60"/>
+              <w:right w:type="dxa" w:w="110"/>
+            </w:tcMar>
+          </w:tcPr>
+          <w:p>
+            <w:pPr>
+              <w:jc w:val="left"/>
+            </w:pPr>
+            <w:r>
+              <w:rPr>
+                <w:b w:val="false"/>
+                <w:bCs w:val="false"/>
+                <w:color w:val="000000"/>
+                <w:sz w:val="19"/>
+                <w:szCs w:val="19"/>
+              </w:rPr>
+              <w:t xml:space="preserve">TreeMap any-LSOG (UT)</w:t>
+            </w:r>
+          </w:p>
+        </w:tc>
+        <w:tc>
+          <w:tcPr>
+            <w:tcW w:type="dxa" w:w="1500"/>
+            <w:tcBorders>
+              <w:top w:val="single" w:color="CCCCCC" w:sz="1"/>
+              <w:left w:val="single" w:color="CCCCCC" w:sz="1"/>
+              <w:bottom w:val="single" w:color="CCCCCC" w:sz="1"/>
+              <w:right w:val="single" w:color="CCCCCC" w:sz="1"/>
+            </w:tcBorders>
+            <w:shd w:fill="FFFFFF" w:val="clear"/>
+            <w:tcMar>
+              <w:top w:type="dxa" w:w="60"/>
+              <w:left w:type="dxa" w:w="110"/>
+              <w:bottom w:type="dxa" w:w="60"/>
+              <w:right w:type="dxa" w:w="110"/>
+            </w:tcMar>
+          </w:tcPr>
+          <w:p>
+            <w:pPr>
+              <w:jc w:val="right"/>
+            </w:pPr>
+            <w:r>
+              <w:rPr>
+                <w:b w:val="false"/>
+                <w:bCs w:val="false"/>
+                <w:color w:val="000000"/>
+                <w:sz w:val="19"/>
+                <w:szCs w:val="19"/>
+              </w:rPr>
+              <w:t xml:space="preserve">6.5%</w:t>
+            </w:r>
+          </w:p>
+        </w:tc>
+        <w:tc>
+          <w:tcPr>
+            <w:tcW w:type="dxa" w:w="1500"/>
+            <w:tcBorders>
+              <w:top w:val="single" w:color="CCCCCC" w:sz="1"/>
+              <w:left w:val="single" w:color="CCCCCC" w:sz="1"/>
+              <w:bottom w:val="single" w:color="CCCCCC" w:sz="1"/>
+              <w:right w:val="single" w:color="CCCCCC" w:sz="1"/>
+            </w:tcBorders>
+            <w:shd w:fill="FFFFFF" w:val="clear"/>
+            <w:tcMar>
+              <w:top w:type="dxa" w:w="60"/>
+              <w:left w:type="dxa" w:w="110"/>
+              <w:bottom w:type="dxa" w:w="60"/>
+              <w:right w:type="dxa" w:w="110"/>
+            </w:tcMar>
+          </w:tcPr>
+          <w:p>
+            <w:pPr>
+              <w:jc w:val="right"/>
+            </w:pPr>
+            <w:r>
+              <w:rPr>
+                <w:b w:val="false"/>
+                <w:bCs w:val="false"/>
+                <w:color w:val="000000"/>
+                <w:sz w:val="19"/>
+                <w:szCs w:val="19"/>
+              </w:rPr>
+              <w:t xml:space="preserve">7.9%</w:t>
+            </w:r>
+          </w:p>
+        </w:tc>
+        <w:tc>
+          <w:tcPr>
+            <w:tcW w:type="dxa" w:w="1500"/>
+            <w:tcBorders>
+              <w:top w:val="single" w:color="CCCCCC" w:sz="1"/>
+              <w:left w:val="single" w:color="CCCCCC" w:sz="1"/>
+              <w:bottom w:val="single" w:color="CCCCCC" w:sz="1"/>
+              <w:right w:val="single" w:color="CCCCCC" w:sz="1"/>
+            </w:tcBorders>
+            <w:shd w:fill="FFFFFF" w:val="clear"/>
+            <w:tcMar>
+              <w:top w:type="dxa" w:w="60"/>
+              <w:left w:type="dxa" w:w="110"/>
+              <w:bottom w:type="dxa" w:w="60"/>
+              <w:right w:type="dxa" w:w="110"/>
+            </w:tcMar>
+          </w:tcPr>
+          <w:p>
+            <w:pPr>
+              <w:jc w:val="right"/>
+            </w:pPr>
+            <w:r>
+              <w:rPr>
+                <w:b w:val="false"/>
+                <w:bCs w:val="false"/>
+                <w:color w:val="000000"/>
+                <w:sz w:val="19"/>
+                <w:szCs w:val="19"/>
+              </w:rPr>
+              <w:t xml:space="preserve">7.8%</w:t>
+            </w:r>
+          </w:p>
+        </w:tc>
+        <w:tc>
+          <w:tcPr>
+            <w:tcW w:type="dxa" w:w="1500"/>
+            <w:tcBorders>
+              <w:top w:val="single" w:color="CCCCCC" w:sz="1"/>
+              <w:left w:val="single" w:color="CCCCCC" w:sz="1"/>
+              <w:bottom w:val="single" w:color="CCCCCC" w:sz="1"/>
+              <w:right w:val="single" w:color="CCCCCC" w:sz="1"/>
+            </w:tcBorders>
+            <w:shd w:fill="FFFFFF" w:val="clear"/>
+            <w:tcMar>
+              <w:top w:type="dxa" w:w="60"/>
+              <w:left w:type="dxa" w:w="110"/>
+              <w:bottom w:type="dxa" w:w="60"/>
+              <w:right w:type="dxa" w:w="110"/>
+            </w:tcMar>
+          </w:tcPr>
+          <w:p>
+            <w:pPr>
+              <w:jc w:val="right"/>
+            </w:pPr>
+            <w:r>
+              <w:rPr>
+                <w:b w:val="false"/>
+                <w:bCs w:val="false"/>
+                <w:color w:val="000000"/>
+                <w:sz w:val="19"/>
+                <w:szCs w:val="19"/>
+              </w:rPr>
+              <w:t xml:space="preserve">+3.2%/yr</w:t>
+            </w:r>
+          </w:p>
+        </w:tc>
+      </w:tr>
+      <w:tr>
+        <w:tc>
+          <w:tcPr>
+            <w:tcW w:type="dxa" w:w="3360"/>
+            <w:tcBorders>
+              <w:top w:val="single" w:color="CCCCCC" w:sz="1"/>
+              <w:left w:val="single" w:color="CCCCCC" w:sz="1"/>
+              <w:bottom w:val="single" w:color="CCCCCC" w:sz="1"/>
+              <w:right w:val="single" w:color="CCCCCC" w:sz="1"/>
+            </w:tcBorders>
+            <w:shd w:fill="FFFFFF" w:val="clear"/>
+            <w:tcMar>
+              <w:top w:type="dxa" w:w="60"/>
+              <w:left w:type="dxa" w:w="110"/>
+              <w:bottom w:type="dxa" w:w="60"/>
+              <w:right w:type="dxa" w:w="110"/>
+            </w:tcMar>
+          </w:tcPr>
+          <w:p>
+            <w:pPr>
+              <w:jc w:val="left"/>
+            </w:pPr>
+            <w:r>
+              <w:rPr>
+                <w:b w:val="false"/>
+                <w:bCs w:val="false"/>
+                <w:color w:val="000000"/>
+                <w:sz w:val="19"/>
+                <w:szCs w:val="19"/>
+              </w:rPr>
+              <w:t xml:space="preserve">FIADB v5.1 any-LSOG (ME plots)</w:t>
+            </w:r>
+          </w:p>
+        </w:tc>
+        <w:tc>
+          <w:tcPr>
+            <w:tcW w:type="dxa" w:w="1500"/>
+            <w:tcBorders>
+              <w:top w:val="single" w:color="CCCCCC" w:sz="1"/>
+              <w:left w:val="single" w:color="CCCCCC" w:sz="1"/>
+              <w:bottom w:val="single" w:color="CCCCCC" w:sz="1"/>
+              <w:right w:val="single" w:color="CCCCCC" w:sz="1"/>
+            </w:tcBorders>
+            <w:shd w:fill="FFFFFF" w:val="clear"/>
+            <w:tcMar>
+              <w:top w:type="dxa" w:w="60"/>
+              <w:left w:type="dxa" w:w="110"/>
+              <w:bottom w:type="dxa" w:w="60"/>
+              <w:right w:type="dxa" w:w="110"/>
+            </w:tcMar>
+          </w:tcPr>
+          <w:p>
+            <w:pPr>
+              <w:jc w:val="right"/>
+            </w:pPr>
+            <w:r>
+              <w:rPr>
+                <w:b w:val="false"/>
+                <w:bCs w:val="false"/>
+                <w:color w:val="000000"/>
+                <w:sz w:val="19"/>
+                <w:szCs w:val="19"/>
+              </w:rPr>
+              <w:t xml:space="preserve">12.2% (2014-18)</w:t>
+            </w:r>
+          </w:p>
+        </w:tc>
+        <w:tc>
+          <w:tcPr>
+            <w:tcW w:type="dxa" w:w="1500"/>
+            <w:tcBorders>
+              <w:top w:val="single" w:color="CCCCCC" w:sz="1"/>
+              <w:left w:val="single" w:color="CCCCCC" w:sz="1"/>
+              <w:bottom w:val="single" w:color="CCCCCC" w:sz="1"/>
+              <w:right w:val="single" w:color="CCCCCC" w:sz="1"/>
+            </w:tcBorders>
+            <w:shd w:fill="FFFFFF" w:val="clear"/>
+            <w:tcMar>
+              <w:top w:type="dxa" w:w="60"/>
+              <w:left w:type="dxa" w:w="110"/>
+              <w:bottom w:type="dxa" w:w="60"/>
+              <w:right w:type="dxa" w:w="110"/>
+            </w:tcMar>
+          </w:tcPr>
+          <w:p>
+            <w:pPr>
+              <w:jc w:val="right"/>
+            </w:pPr>
+            <w:r>
+              <w:rPr>
+                <w:b w:val="false"/>
+                <w:bCs w:val="false"/>
+                <w:color w:val="000000"/>
+                <w:sz w:val="19"/>
+                <w:szCs w:val="19"/>
+              </w:rPr>
+              <w:t xml:space="preserve"/>
+            </w:r>
+          </w:p>
+        </w:tc>
+        <w:tc>
+          <w:tcPr>
+            <w:tcW w:type="dxa" w:w="1500"/>
+            <w:tcBorders>
+              <w:top w:val="single" w:color="CCCCCC" w:sz="1"/>
+              <w:left w:val="single" w:color="CCCCCC" w:sz="1"/>
+              <w:bottom w:val="single" w:color="CCCCCC" w:sz="1"/>
+              <w:right w:val="single" w:color="CCCCCC" w:sz="1"/>
+            </w:tcBorders>
+            <w:shd w:fill="FFFFFF" w:val="clear"/>
+            <w:tcMar>
+              <w:top w:type="dxa" w:w="60"/>
+              <w:left w:type="dxa" w:w="110"/>
+              <w:bottom w:type="dxa" w:w="60"/>
+              <w:right w:type="dxa" w:w="110"/>
+            </w:tcMar>
+          </w:tcPr>
+          <w:p>
+            <w:pPr>
+              <w:jc w:val="right"/>
+            </w:pPr>
+            <w:r>
+              <w:rPr>
+                <w:b w:val="false"/>
+                <w:bCs w:val="false"/>
+                <w:color w:val="000000"/>
+                <w:sz w:val="19"/>
+                <w:szCs w:val="19"/>
+              </w:rPr>
+              <w:t xml:space="preserve">13.7% (2019-23)</w:t>
+            </w:r>
+          </w:p>
+        </w:tc>
+        <w:tc>
+          <w:tcPr>
+            <w:tcW w:type="dxa" w:w="1500"/>
+            <w:tcBorders>
+              <w:top w:val="single" w:color="CCCCCC" w:sz="1"/>
+              <w:left w:val="single" w:color="CCCCCC" w:sz="1"/>
+              <w:bottom w:val="single" w:color="CCCCCC" w:sz="1"/>
+              <w:right w:val="single" w:color="CCCCCC" w:sz="1"/>
+            </w:tcBorders>
+            <w:shd w:fill="FFFFFF" w:val="clear"/>
+            <w:tcMar>
+              <w:top w:type="dxa" w:w="60"/>
+              <w:left w:type="dxa" w:w="110"/>
+              <w:bottom w:type="dxa" w:w="60"/>
+              <w:right w:type="dxa" w:w="110"/>
+            </w:tcMar>
+          </w:tcPr>
+          <w:p>
+            <w:pPr>
+              <w:jc w:val="right"/>
+            </w:pPr>
+            <w:r>
+              <w:rPr>
+                <w:b w:val="false"/>
+                <w:bCs w:val="false"/>
+                <w:color w:val="000000"/>
+                <w:sz w:val="19"/>
+                <w:szCs w:val="19"/>
+              </w:rPr>
+              <w:t xml:space="preserve">+2.4%/yr</w:t>
+            </w:r>
+          </w:p>
+        </w:tc>
+      </w:tr>
+      <w:tr>
+        <w:tc>
+          <w:tcPr>
+            <w:tcW w:type="dxa" w:w="3360"/>
+            <w:tcBorders>
+              <w:top w:val="single" w:color="CCCCCC" w:sz="1"/>
+              <w:left w:val="single" w:color="CCCCCC" w:sz="1"/>
+              <w:bottom w:val="single" w:color="CCCCCC" w:sz="1"/>
+              <w:right w:val="single" w:color="CCCCCC" w:sz="1"/>
+            </w:tcBorders>
+            <w:shd w:fill="FFFFFF" w:val="clear"/>
+            <w:tcMar>
+              <w:top w:type="dxa" w:w="60"/>
+              <w:left w:type="dxa" w:w="110"/>
+              <w:bottom w:type="dxa" w:w="60"/>
+              <w:right w:type="dxa" w:w="110"/>
+            </w:tcMar>
+          </w:tcPr>
+          <w:p>
+            <w:pPr>
+              <w:jc w:val="left"/>
+            </w:pPr>
+            <w:r>
+              <w:rPr>
+                <w:b w:val="false"/>
+                <w:bCs w:val="false"/>
+                <w:color w:val="000000"/>
+                <w:sz w:val="19"/>
+                <w:szCs w:val="19"/>
+              </w:rPr>
+              <w:t xml:space="preserve">Hagan premise</w:t>
+            </w:r>
+          </w:p>
+        </w:tc>
+        <w:tc>
+          <w:tcPr>
+            <w:tcW w:type="dxa" w:w="1500"/>
+            <w:tcBorders>
+              <w:top w:val="single" w:color="CCCCCC" w:sz="1"/>
+              <w:left w:val="single" w:color="CCCCCC" w:sz="1"/>
+              <w:bottom w:val="single" w:color="CCCCCC" w:sz="1"/>
+              <w:right w:val="single" w:color="CCCCCC" w:sz="1"/>
+            </w:tcBorders>
+            <w:shd w:fill="FFFFFF" w:val="clear"/>
+            <w:tcMar>
+              <w:top w:type="dxa" w:w="60"/>
+              <w:left w:type="dxa" w:w="110"/>
+              <w:bottom w:type="dxa" w:w="60"/>
+              <w:right w:type="dxa" w:w="110"/>
+            </w:tcMar>
+          </w:tcPr>
+          <w:p>
+            <w:pPr>
+              <w:jc w:val="right"/>
+            </w:pPr>
+            <w:r>
+              <w:rPr>
+                <w:b w:val="false"/>
+                <w:bCs w:val="false"/>
+                <w:color w:val="000000"/>
+                <w:sz w:val="19"/>
+                <w:szCs w:val="19"/>
+              </w:rPr>
+              <w:t xml:space="preserve"/>
+            </w:r>
+          </w:p>
+        </w:tc>
+        <w:tc>
+          <w:tcPr>
+            <w:tcW w:type="dxa" w:w="1500"/>
+            <w:tcBorders>
+              <w:top w:val="single" w:color="CCCCCC" w:sz="1"/>
+              <w:left w:val="single" w:color="CCCCCC" w:sz="1"/>
+              <w:bottom w:val="single" w:color="CCCCCC" w:sz="1"/>
+              <w:right w:val="single" w:color="CCCCCC" w:sz="1"/>
+            </w:tcBorders>
+            <w:shd w:fill="FFFFFF" w:val="clear"/>
+            <w:tcMar>
+              <w:top w:type="dxa" w:w="60"/>
+              <w:left w:type="dxa" w:w="110"/>
+              <w:bottom w:type="dxa" w:w="60"/>
+              <w:right w:type="dxa" w:w="110"/>
+            </w:tcMar>
+          </w:tcPr>
+          <w:p>
+            <w:pPr>
+              <w:jc w:val="right"/>
+            </w:pPr>
+            <w:r>
+              <w:rPr>
+                <w:b w:val="false"/>
+                <w:bCs w:val="false"/>
+                <w:color w:val="000000"/>
+                <w:sz w:val="19"/>
+                <w:szCs w:val="19"/>
+              </w:rPr>
+              <w:t xml:space="preserve"/>
+            </w:r>
+          </w:p>
+        </w:tc>
+        <w:tc>
+          <w:tcPr>
+            <w:tcW w:type="dxa" w:w="1500"/>
+            <w:tcBorders>
+              <w:top w:val="single" w:color="CCCCCC" w:sz="1"/>
+              <w:left w:val="single" w:color="CCCCCC" w:sz="1"/>
+              <w:bottom w:val="single" w:color="CCCCCC" w:sz="1"/>
+              <w:right w:val="single" w:color="CCCCCC" w:sz="1"/>
+            </w:tcBorders>
+            <w:shd w:fill="FFFFFF" w:val="clear"/>
+            <w:tcMar>
+              <w:top w:type="dxa" w:w="60"/>
+              <w:left w:type="dxa" w:w="110"/>
+              <w:bottom w:type="dxa" w:w="60"/>
+              <w:right w:type="dxa" w:w="110"/>
+            </w:tcMar>
+          </w:tcPr>
+          <w:p>
+            <w:pPr>
+              <w:jc w:val="right"/>
+            </w:pPr>
+            <w:r>
+              <w:rPr>
+                <w:b w:val="false"/>
+                <w:bCs w:val="false"/>
+                <w:color w:val="000000"/>
+                <w:sz w:val="19"/>
+                <w:szCs w:val="19"/>
+              </w:rPr>
+              <w:t xml:space="preserve"/>
+            </w:r>
+          </w:p>
+        </w:tc>
+        <w:tc>
+          <w:tcPr>
+            <w:tcW w:type="dxa" w:w="1500"/>
+            <w:tcBorders>
+              <w:top w:val="single" w:color="CCCCCC" w:sz="1"/>
+              <w:left w:val="single" w:color="CCCCCC" w:sz="1"/>
+              <w:bottom w:val="single" w:color="CCCCCC" w:sz="1"/>
+              <w:right w:val="single" w:color="CCCCCC" w:sz="1"/>
+            </w:tcBorders>
+            <w:shd w:fill="FFFFFF" w:val="clear"/>
+            <w:tcMar>
+              <w:top w:type="dxa" w:w="60"/>
+              <w:left w:type="dxa" w:w="110"/>
+              <w:bottom w:type="dxa" w:w="60"/>
+              <w:right w:type="dxa" w:w="110"/>
+            </w:tcMar>
+          </w:tcPr>
+          <w:p>
+            <w:pPr>
+              <w:jc w:val="right"/>
+            </w:pPr>
+            <w:r>
+              <w:rPr>
+                <w:b w:val="false"/>
+                <w:bCs w:val="false"/>
+                <w:color w:val="000000"/>
+                <w:sz w:val="19"/>
+                <w:szCs w:val="19"/>
+              </w:rPr>
+              <w:t xml:space="preserve">-1.37 to -2.19%/yr</w:t>
+            </w:r>
+          </w:p>
+        </w:tc>
+      </w:tr>
+    </w:tbl>
+    <w:p>
+      <w:pPr>
+        <w:spacing w:after="40" w:before="80"/>
+        <w:jc w:val="center"/>
+      </w:pPr>
+      <w:r>
+        <w:drawing>
+          <wp:inline distT="0" distB="0" distL="0" distR="0">
+            <wp:extent cx="4095750" cy="2352675"/>
+            <wp:effectExtent t="0" r="0" b="0" l="0"/>
+            <wp:docPr id="1" name="Figure 5. Two independent stock measurements (TreeMap and FIADB) show LSOG increasing, against Hagan's claimed rapid loss." descr="Figure 5. Two independent stock measurements (TreeMap and FIADB) show LSOG increasing, against Hagan's claimed rapid loss." title="Figure 5. Two independent stock measurements (TreeMap and FIADB) show LSOG increasing, against Hagan's claimed rapid loss."/>
+            <wp:cNvGraphicFramePr>
+              <a:graphicFrameLocks xmlns:a="http://schemas.openxmlformats.org/drawingml/2006/main" noChangeAspect="1"/>
+            </wp:cNvGraphicFramePr>
+            <a:graphic xmlns:a="http://schemas.openxmlformats.org/drawingml/2006/main">
+              <a:graphicData uri="http://schemas.openxmlformats.org/drawingml/2006/picture">
+                <pic:pic xmlns:pic="http://schemas.openxmlformats.org/drawingml/2006/picture">
+                  <pic:nvPicPr>
+                    <pic:cNvPr id="0" name="" descr=""/>
+                    <pic:cNvPicPr>
+                      <a:picLocks noChangeAspect="1" noChangeArrowheads="1"/>
+                    </pic:cNvPicPr>
+                  </pic:nvPicPr>
+                  <pic:blipFill>
+                    <a:blip r:embed="rId12" cstate="none"/>
+                    <a:srcRect/>
+                    <a:stretch>
+                      <a:fillRect/>
+                    </a:stretch>
+                  </pic:blipFill>
+                  <pic:spPr bwMode="auto">
+                    <a:xfrm>
+                      <a:off x="0" y="0"/>
+                      <a:ext cx="4095750" cy="2352675"/>
+                    </a:xfrm>
+                    <a:prstGeom prst="rect">
+                      <a:avLst/>
+                    </a:prstGeom>
+                  </pic:spPr>
+                </pic:pic>
+              </a:graphicData>
+            </a:graphic>
+          </wp:inline>
+        </w:drawing>
+      </w:r>
+    </w:p>
+    <w:p>
+      <w:pPr>
+        <w:spacing w:after="160"/>
+        <w:jc w:val="center"/>
+      </w:pPr>
+      <w:r>
+        <w:rPr>
+          <w:i/>
+          <w:iCs/>
+          <w:color w:val="666666"/>
+          <w:sz w:val="17"/>
+          <w:szCs w:val="17"/>
+        </w:rPr>
+        <w:t xml:space="preserve">Figure 5. Two independent stock measurements (TreeMap and FIADB) show LSOG increasing, against Hagan's claimed rapid loss.</w:t>
+      </w:r>
+    </w:p>
+    <w:p>
+      <w:pPr>
+        <w:spacing w:after="120"/>
+      </w:pPr>
+      <w:r>
+        <w:rPr>
+          <w:b/>
+          <w:bCs/>
+        </w:rPr>
+        <w:t xml:space="preserve">How can both be true? </w:t>
+      </w:r>
+      <w:r>
+        <w:t xml:space="preserve">Hagan's "loss" is a gross harvest flux, the count of mapped LSOG hectares that experienced more than 30% canopy removal in the Global Forest Watch record, not a remeasured stock. It does not net out ingrowth, the younger stands that mature into LSOG condition each year. FIA and TreeMap measure the net stock, which rises when aging more than replaces the hectares harvested. Hagan correctly measures that LSOG stands are being harvested at roughly 2%/yr; FIA and TreeMap correctly measure that the total stock is not declining. Both are real and answer different questions, consistent with Birdsey et al. (2025).</w:t>
+      </w:r>
+    </w:p>
+    <w:p>
+      <w:pPr>
+        <w:spacing w:after="120"/>
+      </w:pPr>
+      <w:r>
+        <w:rPr>
+          <w:b/>
+          <w:bCs/>
+        </w:rPr>
+        <w:t xml:space="preserve">Caveats. </w:t>
+      </w:r>
+      <w:r>
+        <w:t xml:space="preserve">TreeMap year differences blend real change with FIA-panel vintage and imputation-model updates, so the robust signal is the direction (not declining), shared with the design-based FIA plots, rather than the precise rate. Adding TreeMap as a third method also widens the amount disagreement to about 2.8 times (7.8% to 21.9% any-LSOG).</w:t>
+      </w:r>
+    </w:p>
+    <w:p>
+      <w:pPr>
+        <w:pStyle w:val="Heading1"/>
+      </w:pPr>
+      <w:r>
+        <w:t xml:space="preserve">8.  Recommendations</w:t>
       </w:r>
     </w:p>
     <w:p>
@@ -2156,7 +2959,24 @@
           <w:sz w:val="21"/>
           <w:szCs w:val="21"/>
         </w:rPr>
-        <w:t xml:space="preserve">Ensure reports informing LD 1529, including Thompson et al. (2026), carry the mapping uncertainty in the headline rather than the appendix.</w:t>
+        <w:t xml:space="preserve">Distinguish harvest flux from net stock: report both the rate at which LSOG stands are harvested and the trend in total LSOG area, which are different quantities pointing in different directions.</w:t>
+      </w:r>
+    </w:p>
+    <w:p>
+      <w:pPr>
+        <w:pStyle w:val="ListParagraph"/>
+        <w:numPr>
+          <w:ilvl w:val="0"/>
+          <w:numId w:val="1"/>
+        </w:numPr>
+        <w:spacing w:after="80"/>
+      </w:pPr>
+      <w:r>
+        <w:rPr>
+          <w:sz w:val="21"/>
+          <w:szCs w:val="21"/>
+        </w:rPr>
+        <w:t xml:space="preserve">Ensure reports informing LD 1529, including Thompson et al. (2026), carry the mapping uncertainty and the stock-versus-flux distinction in the headline rather than the appendix.</w:t>
       </w:r>
     </w:p>
     <w:p>
@@ -2200,7 +3020,7 @@
       <w:r>
         <w:t xml:space="preserve"> 17:e70670.  </w:t>
       </w:r>
-      <w:hyperlink w:history="1" r:id="rIdvcdes4q5ciyftlhsm0zty">
+      <w:hyperlink w:history="1" r:id="rIdm0t9ygv9yblwubz5oi5c6">
         <w:r>
           <w:rPr>
             <w:rStyle w:val="Hyperlink"/>

</xml_diff>